<commit_message>
docs(adr): keep E03-S02 and E03-S03 in Sprint 2
Aaron plans to finish SCRUM-33 and SCRUM-34 this sprint, so they were
moved back from Sprint 3 in Jira. Update ADR-017's status section and the
Sprint 2 status in .agents/STATE.md to match, and regenerate the same-day
ADR export.

Co-Authored-By: Claude Opus 5.5 <noreply@anthropic.com>
</commit_message>
<xml_diff>
--- a/docs/ARCHITECTURE DECISION RECORDS CAA 300926.docx
+++ b/docs/ARCHITECTURE DECISION RECORDS CAA 300926.docx
@@ -4802,17 +4802,17 @@
     </w:p>
     <w:p>
       <w:r>
-        <w:t>the skeleton. Two Sprint 2 stories not started when this decision was made,</w:t>
-      </w:r>
-    </w:p>
-    <w:p>
-      <w:r>
-        <w:t>E03-S02 (SCRUM-33) and E03-S03 (SCRUM-34), were rolled to Sprint 3 and will be</w:t>
-      </w:r>
-    </w:p>
-    <w:p>
-      <w:r>
-        <w:t>built end to end by their owner under this model.</w:t>
+        <w:t>the skeleton. Two Sprint 2 stories not yet started when this decision was</w:t>
+      </w:r>
+    </w:p>
+    <w:p>
+      <w:r>
+        <w:t>made, E03-S02 (SCRUM-33) and E03-S03 (SCRUM-34), stay in Sprint 2; their owner</w:t>
+      </w:r>
+    </w:p>
+    <w:p>
+      <w:r>
+        <w:t>plans to finish them this sprint and builds both sides under this model.</w:t>
       </w:r>
     </w:p>
     <w:p>

</xml_diff>

<commit_message>
docs(adr): note that #158 fixed the Coordinator login redirect
#158 sends Event Coordinators to /coordinator after sign-in. Venue Staff,
Technical Support and Admins still land on /events. Correct ADR-017 and the
follow-up list in .agents/STATE.md to match, and regenerate the same-day ADR
export.

Co-Authored-By: Claude Opus 5.5 <noreply@anthropic.com>
</commit_message>
<xml_diff>
--- a/docs/ARCHITECTURE DECISION RECORDS CAA 300926.docx
+++ b/docs/ARCHITECTURE DECISION RECORDS CAA 300926.docx
@@ -4666,17 +4666,22 @@
         <w:rPr>
           <w:sz w:val="22"/>
         </w:rPr>
-        <w:t>One route list removes a class of bug. For example, sign-in currently sends</w:t>
-      </w:r>
-    </w:p>
-    <w:p>
-      <w:r>
-        <w:t>every staff role to the Organiser-only `/events` page, because the login</w:t>
-      </w:r>
-    </w:p>
-    <w:p>
-      <w:r>
-        <w:t>redirect was never updated when role pages went live.</w:t>
+        <w:t>One route list removes a class of bug. For example, the login redirect was</w:t>
+      </w:r>
+    </w:p>
+    <w:p>
+      <w:r>
+        <w:t>never updated when role pages went live, so sign-in sent every staff role to</w:t>
+      </w:r>
+    </w:p>
+    <w:p>
+      <w:r>
+        <w:t>the Organiser-only `/events` page. #158 fixed it for Event Coordinators;</w:t>
+      </w:r>
+    </w:p>
+    <w:p>
+      <w:r>
+        <w:t>Venue Staff, Technical Support and Admins still land on `/events`.</w:t>
       </w:r>
     </w:p>
     <w:p>

</xml_diff>